<commit_message>
Added a chnages in invoice and receipt document
</commit_message>
<xml_diff>
--- a/PaymentReceipt.docx
+++ b/PaymentReceipt.docx
@@ -78,7 +78,6 @@
                       </w:tcBorders>
                     </w:tcPr>
                     <w:p>
-                      <w:proofErr w:type="spellStart"/>
                       <w:r>
                         <w:rPr>
                           <w:b/>
@@ -88,7 +87,6 @@
                         </w:rPr>
                         <w:t>CompanyName</w:t>
                       </w:r>
-                      <w:proofErr w:type="spellEnd"/>
                     </w:p>
                   </w:tc>
                 </w:sdtContent>
@@ -148,11 +146,9 @@
                       </w:tcBorders>
                     </w:tcPr>
                     <w:p>
-                      <w:proofErr w:type="spellStart"/>
                       <w:r>
                         <w:t>CompanyAddress</w:t>
                       </w:r>
-                      <w:proofErr w:type="spellEnd"/>
                     </w:p>
                   </w:tc>
                 </w:sdtContent>
@@ -187,9 +183,9 @@
                           <w:noProof/>
                         </w:rPr>
                         <w:drawing>
-                          <wp:inline distT="0" distB="0" distL="0" distR="0" wp14:anchorId="1339894C" wp14:editId="3733C26C">
-                            <wp:extent cx="944880" cy="944880"/>
-                            <wp:effectExtent l="0" t="0" r="7620" b="7620"/>
+                          <wp:inline distT="0" distB="0" distL="0" distR="0" wp14:anchorId="1339894C" wp14:editId="51FB0E33">
+                            <wp:extent cx="1577340" cy="944880"/>
+                            <wp:effectExtent l="0" t="0" r="3810" b="7620"/>
                             <wp:docPr id="1481787238" name="Picture 1"/>
                             <wp:cNvGraphicFramePr>
                               <a:graphicFrameLocks xmlns:a="http://schemas.openxmlformats.org/drawingml/2006/main" noChangeAspect="1"/>
@@ -212,7 +208,7 @@
                                   <pic:spPr bwMode="auto">
                                     <a:xfrm>
                                       <a:off x="0" y="0"/>
-                                      <a:ext cx="944880" cy="944880"/>
+                                      <a:ext cx="1577340" cy="944880"/>
                                     </a:xfrm>
                                     <a:prstGeom prst="rect">
                                       <a:avLst/>
@@ -257,7 +253,6 @@
                       <w:text/>
                     </w:sdtPr>
                     <w:sdtContent>
-                      <w:proofErr w:type="spellStart"/>
                       <w:r>
                         <w:t>CompanyCity</w:t>
                       </w:r>
@@ -281,7 +276,6 @@
                       <w:r>
                         <w:t>CompanyPostcode</w:t>
                       </w:r>
-                      <w:proofErr w:type="spellEnd"/>
                     </w:sdtContent>
                   </w:sdt>
                   <w:r>
@@ -290,7 +284,6 @@
                   <w:r>
                     <w:t>,</w:t>
                   </w:r>
-                  <w:proofErr w:type="spellStart"/>
                   <w:sdt>
                     <w:sdtPr>
                       <w:alias w:val="#Nav: /Payment_Mode2/CompanyCountry"/>
@@ -306,7 +299,6 @@
                       <w:r>
                         <w:t>CompanyCountry</w:t>
                       </w:r>
-                      <w:proofErr w:type="spellEnd"/>
                     </w:sdtContent>
                   </w:sdt>
                 </w:p>
@@ -353,11 +345,9 @@
                       <w:text/>
                     </w:sdtPr>
                     <w:sdtContent>
-                      <w:proofErr w:type="spellStart"/>
                       <w:r>
                         <w:t>CompanyPhone</w:t>
                       </w:r>
-                      <w:proofErr w:type="spellEnd"/>
                     </w:sdtContent>
                   </w:sdt>
                 </w:p>
@@ -404,11 +394,9 @@
                       <w:text/>
                     </w:sdtPr>
                     <w:sdtContent>
-                      <w:proofErr w:type="spellStart"/>
                       <w:r>
                         <w:t>CompanyEmail</w:t>
                       </w:r>
-                      <w:proofErr w:type="spellEnd"/>
                     </w:sdtContent>
                   </w:sdt>
                 </w:p>
@@ -458,11 +446,9 @@
                       <w:text/>
                     </w:sdtPr>
                     <w:sdtContent>
-                      <w:proofErr w:type="spellStart"/>
                       <w:r>
                         <w:t>CompanyTRN</w:t>
                       </w:r>
-                      <w:proofErr w:type="spellEnd"/>
                     </w:sdtContent>
                   </w:sdt>
                 </w:p>
@@ -507,9 +493,23 @@
                   <w:r>
                     <w:t xml:space="preserve">Receipt No: </w:t>
                   </w:r>
-                  <w:r>
-                    <w:t>1</w:t>
-                  </w:r>
+                  <w:sdt>
+                    <w:sdtPr>
+                      <w:id w:val="837121487"/>
+                      <w:placeholder>
+                        <w:docPart w:val="DefaultPlaceholder_-1854013440"/>
+                      </w:placeholder>
+                      <w:dataBinding w:prefixMappings="xmlns:ns0='urn:microsoft-dynamics-nav/reports/PaymentReceipt/50112/' " w:xpath="/ns0:NavWordReportXmlPart[1]/ns0:Payment_Mode2[1]/ns0:Receipt__[1]" w:storeItemID="{072A5C88-FD1B-4274-ACD9-2C46D19524E4}"/>
+                      <w:text/>
+                      <w:alias w:val="#Nav: /Payment_Mode2/Receipt__"/>
+                      <w:tag w:val="#Nav: PaymentReceipt/50112"/>
+                    </w:sdtPr>
+                    <w:sdtContent>
+                      <w:r>
+                        <w:t>Receipt__</w:t>
+                      </w:r>
+                    </w:sdtContent>
+                  </w:sdt>
                 </w:p>
               </w:tc>
             </w:tr>
@@ -544,11 +544,9 @@
                       <w:text/>
                     </w:sdtPr>
                     <w:sdtContent>
-                      <w:proofErr w:type="spellStart"/>
                       <w:r>
                         <w:t>CurrentDate</w:t>
                       </w:r>
-                      <w:proofErr w:type="spellEnd"/>
                     </w:sdtContent>
                   </w:sdt>
                 </w:p>
@@ -637,11 +635,9 @@
                       </w:tcBorders>
                     </w:tcPr>
                     <w:p>
-                      <w:proofErr w:type="spellStart"/>
                       <w:r>
                         <w:t>Tenant_Name</w:t>
                       </w:r>
-                      <w:proofErr w:type="spellEnd"/>
                     </w:p>
                   </w:tc>
                 </w:sdtContent>
@@ -670,11 +666,9 @@
                       <w:text/>
                     </w:sdtPr>
                     <w:sdtContent>
-                      <w:proofErr w:type="spellStart"/>
                       <w:r>
                         <w:t>Contract_ID</w:t>
                       </w:r>
-                      <w:proofErr w:type="spellEnd"/>
                     </w:sdtContent>
                   </w:sdt>
                 </w:p>
@@ -738,11 +732,9 @@
                       <w:text/>
                     </w:sdtPr>
                     <w:sdtContent>
-                      <w:proofErr w:type="spellStart"/>
                       <w:r>
                         <w:t>Property_Name</w:t>
                       </w:r>
-                      <w:proofErr w:type="spellEnd"/>
                     </w:sdtContent>
                   </w:sdt>
                 </w:p>
@@ -777,13 +769,8 @@
                       <w:text/>
                     </w:sdtPr>
                     <w:sdtContent>
-                      <w:proofErr w:type="spellStart"/>
                       <w:r>
-                        <w:t>Phone_No</w:t>
-                      </w:r>
-                      <w:proofErr w:type="spellEnd"/>
-                      <w:r>
-                        <w:t>_</w:t>
+                        <w:t>Phone_No_</w:t>
                       </w:r>
                     </w:sdtContent>
                   </w:sdt>
@@ -814,11 +801,9 @@
                       <w:text/>
                     </w:sdtPr>
                     <w:sdtContent>
-                      <w:proofErr w:type="spellStart"/>
                       <w:r>
                         <w:t>Unit_Name</w:t>
                       </w:r>
-                      <w:proofErr w:type="spellEnd"/>
                     </w:sdtContent>
                   </w:sdt>
                 </w:p>
@@ -853,11 +838,9 @@
                       <w:text/>
                     </w:sdtPr>
                     <w:sdtContent>
-                      <w:proofErr w:type="spellStart"/>
                       <w:r>
                         <w:t>Tenant_Email</w:t>
                       </w:r>
-                      <w:proofErr w:type="spellEnd"/>
                     </w:sdtContent>
                   </w:sdt>
                 </w:p>
@@ -887,11 +870,9 @@
                       <w:text/>
                     </w:sdtPr>
                     <w:sdtContent>
-                      <w:proofErr w:type="spellStart"/>
                       <w:r>
                         <w:t>Contract_Start_Date</w:t>
                       </w:r>
-                      <w:proofErr w:type="spellEnd"/>
                     </w:sdtContent>
                   </w:sdt>
                   <w:r>
@@ -909,11 +890,9 @@
                       <w:text/>
                     </w:sdtPr>
                     <w:sdtContent>
-                      <w:proofErr w:type="spellStart"/>
                       <w:r>
                         <w:t>Contract_End_Date</w:t>
                       </w:r>
-                      <w:proofErr w:type="spellEnd"/>
                     </w:sdtContent>
                   </w:sdt>
                 </w:p>
@@ -937,21 +916,19 @@
                   </w:r>
                   <w:sdt>
                     <w:sdtPr>
+                      <w:alias w:val="#Nav: /Payment_Mode2/Customer/Cus_TRN"/>
+                      <w:tag w:val="#Nav: PaymentReceipt/50112"/>
                       <w:id w:val="2008099593"/>
                       <w:placeholder>
                         <w:docPart w:val="DefaultPlaceholder_-1854013440"/>
                       </w:placeholder>
                       <w:dataBinding w:prefixMappings="xmlns:ns0='urn:microsoft-dynamics-nav/reports/PaymentReceipt/50112/'" w:xpath="/ns0:NavWordReportXmlPart[1]/ns0:Payment_Mode2[1]/ns0:Customer[1]/ns0:Cus_TRN[1]" w:storeItemID="{072A5C88-FD1B-4274-ACD9-2C46D19524E4}"/>
                       <w:text/>
-                      <w:alias w:val="#Nav: /Payment_Mode2/Customer/Cus_TRN"/>
-                      <w:tag w:val="#Nav: PaymentReceipt/50112"/>
                     </w:sdtPr>
                     <w:sdtContent>
-                      <w:proofErr w:type="spellStart"/>
                       <w:r>
                         <w:t>Cus_TRN</w:t>
                       </w:r>
-                      <w:proofErr w:type="spellEnd"/>
                     </w:sdtContent>
                   </w:sdt>
                 </w:p>
@@ -980,11 +957,9 @@
                       <w:text/>
                     </w:sdtPr>
                     <w:sdtContent>
-                      <w:proofErr w:type="spellStart"/>
                       <w:r>
                         <w:t>Contract_Tenor</w:t>
                       </w:r>
-                      <w:proofErr w:type="spellEnd"/>
                     </w:sdtContent>
                   </w:sdt>
                 </w:p>
@@ -1205,7 +1180,7 @@
                 <w:alias w:val="#Nav: /Payment_Mode2/Payment_Schedule2"/>
                 <w:tag w:val="#Nav: PaymentReceipt/50112"/>
                 <w:id w:val="-836683949"/>
-                <w15:dataBinding w:prefixMappings="xmlns:ns0='urn:microsoft-dynamics-nav/reports/PaymentReceipt/50112/'" w:xpath="/ns0:NavWordReportXmlPart[1]/ns0:Payment_Mode2[1]/ns0:Payment_Schedule2" w:storeItemID="{072A5C88-FD1B-4274-ACD9-2C46D19524E4}"/>
+                <w15:dataBinding w:prefixMappings="xmlns:ns0='urn:microsoft-dynamics-nav/reports/PaymentReceipt/50112/' " w:xpath="/ns0:NavWordReportXmlPart[1]/ns0:Payment_Mode2[1]/ns0:Payment_Schedule2" w:storeItemID="{072A5C88-FD1B-4274-ACD9-2C46D19524E4}"/>
                 <w15:repeatingSection/>
               </w:sdtPr>
               <w:sdtContent>
@@ -1239,11 +1214,9 @@
                               <w:tcW w:w="1020" w:type="dxa"/>
                             </w:tcPr>
                             <w:p>
-                              <w:proofErr w:type="spellStart"/>
                               <w:r>
                                 <w:t>Pay_S</w:t>
                               </w:r>
-                              <w:proofErr w:type="spellEnd"/>
                             </w:p>
                           </w:tc>
                         </w:sdtContent>
@@ -1289,11 +1262,9 @@
                               <w:tcW w:w="3402" w:type="dxa"/>
                             </w:tcPr>
                             <w:p>
-                              <w:proofErr w:type="spellStart"/>
                               <w:r>
                                 <w:t>Secondary_Item_Type</w:t>
                               </w:r>
-                              <w:proofErr w:type="spellEnd"/>
                             </w:p>
                           </w:tc>
                         </w:sdtContent>
@@ -1315,11 +1286,9 @@
                               <w:tcW w:w="1843" w:type="dxa"/>
                             </w:tcPr>
                             <w:p>
-                              <w:proofErr w:type="spellStart"/>
                               <w:r>
                                 <w:t>Pay_M</w:t>
                               </w:r>
-                              <w:proofErr w:type="spellEnd"/>
                             </w:p>
                           </w:tc>
                         </w:sdtContent>
@@ -1341,11 +1310,9 @@
                               <w:tcW w:w="1276" w:type="dxa"/>
                             </w:tcPr>
                             <w:p>
-                              <w:proofErr w:type="spellStart"/>
                               <w:r>
                                 <w:t>Che_N</w:t>
                               </w:r>
-                              <w:proofErr w:type="spellEnd"/>
                             </w:p>
                           </w:tc>
                         </w:sdtContent>
@@ -1677,11 +1644,9 @@
                           <w:bCs/>
                         </w:rPr>
                       </w:pPr>
-                      <w:proofErr w:type="spellStart"/>
                       <w:r>
                         <w:t>AmountInWords</w:t>
                       </w:r>
-                      <w:proofErr w:type="spellEnd"/>
                     </w:p>
                   </w:sdtContent>
                 </w:sdt>
@@ -2560,6 +2525,7 @@
     <w:rsid w:val="0092048B"/>
     <w:rsid w:val="00945EDD"/>
     <w:rsid w:val="00947FBA"/>
+    <w:rsid w:val="009718E3"/>
     <w:rsid w:val="009B0BD0"/>
     <w:rsid w:val="009C4C5B"/>
     <w:rsid w:val="009F2EE6"/>
@@ -2586,6 +2552,7 @@
     <w:rsid w:val="00C77BAC"/>
     <w:rsid w:val="00CC46D9"/>
     <w:rsid w:val="00CE70BE"/>
+    <w:rsid w:val="00CF77BD"/>
     <w:rsid w:val="00D1285F"/>
     <w:rsid w:val="00D20B7E"/>
     <w:rsid w:val="00D352FA"/>
@@ -3370,7 +3337,73 @@
 </a:theme>
 </file>
 
-<file path=customXml/item1.xml>��< ? x m l   v e r s i o n = " 1 . 0 "   e n c o d i n g = " u t f - 1 6 " ? > < N a v W o r d R e p o r t X m l P a r t   x m l n s = " u r n : m i c r o s o f t - d y n a m i c s - n a v / r e p o r t s / P a y m e n t R e c e i p t / 5 0 1 1 2 / " > +<file path=customXml/item1.xml>��< ? x m l   v e r s i o n = " 1 . 0 "   e n c o d i n g = " u t f - 1 6 " ? > + 
+ < N a v W o r d R e p o r t X m l P a r t   x m l n s = " u r n : m i c r o s o f t - d y n a m i c s - n a v / r e p o r t s / P a y m e n t R e c e i p t / 5 0 1 1 2 / " > + 
+     < B C R e p o r t I n f o r m a t i o n > + 
+         < R e p o r t M e t a d a t a > + 
+             < E x t e n s i o n I d > E x t e n s i o n   I D < / E x t e n s i o n I d > + 
+             < E x t e n s i o n N a m e > E x t e n s i o n   N a m e < / E x t e n s i o n N a m e > + 
+             < E x t e n s i o n P u b l i s h e r > E x t e n s i o n   P u b l i s h e r < / E x t e n s i o n P u b l i s h e r > + 
+             < E x t e n s i o n V e r s i o n > E x t e n s i o n   V e r s i o n < / E x t e n s i o n V e r s i o n > + 
+             < R e p o r t I d > R e p o r t   I D < / R e p o r t I d > + 
+             < R e p o r t N a m e > R e p o r t   N a m e < / R e p o r t N a m e > + 
+             < A b o u t T h i s R e p o r t T i t l e > A b o u t   T h i s   R e p o r t   T i t l e < / A b o u t T h i s R e p o r t T i t l e > + 
+             < A b o u t T h i s R e p o r t T e x t > A b o u t   T h i s   R e p o r t   T e x t < / A b o u t T h i s R e p o r t T e x t > + 
+             < R e p o r t H e l p L i n k > R e p o r t   H e l p   L i n k < / R e p o r t H e l p L i n k > + 
+         < / R e p o r t M e t a d a t a > + 
+         < R e p o r t R e q u e s t > + 
+             < T e n a n t E n t r a I d > T e n a n t   E n t r a   I d < / T e n a n t E n t r a I d > + 
+             < E n v i r o n m e n t N a m e > E n v i r o n m e n t   N a m e < / E n v i r o n m e n t N a m e > + 
+             < E n v i r o n m e n t T y p e > E n v i r o n m e n t   T y p e < / E n v i r o n m e n t T y p e > + 
+             < C o m p a n y N a m e > C o m p a n y   N a m e < / C o m p a n y N a m e > + 
+             < C o m p a n y D i s p l a y N a m e > C o m p a n y   D i s p l a y   N a m e < / C o m p a n y D i s p l a y N a m e > + 
+             < C o m p a n y I d > C o m p a n y   I D < / C o m p a n y I d > + 
+             < U s e r N a m e > U s e r   N a m e < / U s e r N a m e > + 
+             < D a t e A n d T i m e > D a t e   a n d   T i m e < / D a t e A n d T i m e > + 
+             < L a n g u a g e > L a n g u a g e < / L a n g u a g e > + 
+             < F o r m a t R e g i o n > F o r m a t   R e g i o n < / F o r m a t R e g i o n > + 
+             < D a t e T i m e V a l u e s > + 
+                 < Y e a r > Y e a r < / Y e a r > + 
+                 < M o n t h N u m b e r > M o n t h   N u m b e r < / M o n t h N u m b e r > + 
+                 < D a y N u m b e r > D a y   N u m b e r < / D a y N u m b e r > + 
+                 < H o u r > H o u r < / H o u r > + 
+                 < M i n u t e > M i n u t e < / M i n u t e > + 
+             < / D a t e T i m e V a l u e s > + 
+         < / R e p o r t R e q u e s t > + 
+     < / B C R e p o r t I n f o r m a t i o n >   
      < P a y m e n t _ M o d e 2 >   
@@ -3386,7 +3419,7 @@
  
          < C o m p a n y P h o n e > C o m p a n y P h o n e < / C o m p a n y P h o n e >   
-         < C o m p a n y P i c t u r e > C o m p a n y P i c t u r e < / C o m p a n y P i c t u r e > +         < C o m p a n y P i c t u r e   / >   
          < C o m p a n y P o s t c o d e > C o m p a n y P o s t c o d e < / C o m p a n y P o s t c o d e >   
@@ -3395,6 +3428,8 @@
          < C o n t r a c t _ I D > C o n t r a c t _ I D < / C o n t r a c t _ I D >   
          < C u r r e n t D a t e > C u r r e n t D a t e < / C u r r e n t D a t e > + 
+         < R e c e i p t _ _ > R e c e i p t _ _ < / R e c e i p t _ _ >   
          < T e n a n t _ E m a i l > T e n a n t _ E m a i l < / T e n a n t _ E m a i l >   

</xml_diff>

<commit_message>
fix: update filter conditions for payment schedules and enhance payment receipt report columns
</commit_message>
<xml_diff>
--- a/PaymentReceipt.docx
+++ b/PaymentReceipt.docx
@@ -1,6 +1,6 @@
 
 <file path=word/document.xml><?xml version="1.0" encoding="utf-8"?>
-<w:document xmlns:a="http://schemas.openxmlformats.org/drawingml/2006/main" xmlns:pic="http://schemas.openxmlformats.org/drawingml/2006/picture" xmlns:wpc="http://schemas.microsoft.com/office/word/2010/wordprocessingCanvas" xmlns:cx="http://schemas.microsoft.com/office/drawing/2014/chartex" xmlns:cx1="http://schemas.microsoft.com/office/drawing/2015/9/8/chartex" xmlns:cx2="http://schemas.microsoft.com/office/drawing/2015/10/21/chartex" xmlns:cx3="http://schemas.microsoft.com/office/drawing/2016/5/9/chartex" xmlns:cx4="http://schemas.microsoft.com/office/drawing/2016/5/10/chartex" xmlns:cx5="http://schemas.microsoft.com/office/drawing/2016/5/11/chartex" xmlns:cx6="http://schemas.microsoft.com/office/drawing/2016/5/12/chartex" xmlns:cx7="http://schemas.microsoft.com/office/drawing/2016/5/13/chartex" xmlns:cx8="http://schemas.microsoft.com/office/drawing/2016/5/14/chartex" xmlns:mc="http://schemas.openxmlformats.org/markup-compatibility/2006" xmlns:aink="http://schemas.microsoft.com/office/drawing/2016/ink" xmlns:am3d="http://schemas.microsoft.com/office/drawing/2017/model3d" xmlns:o="urn:schemas-microsoft-com:office:office" xmlns:oel="http://schemas.microsoft.com/office/2019/extlst" xmlns:r="http://schemas.openxmlformats.org/officeDocument/2006/relationships" xmlns:m="http://schemas.openxmlformats.org/officeDocument/2006/math" xmlns:v="urn:schemas-microsoft-com:vml" xmlns:wp14="http://schemas.microsoft.com/office/word/2010/wordprocessingDrawing" xmlns:wp="http://schemas.openxmlformats.org/drawingml/2006/wordprocessingDrawing" xmlns:w10="urn:schemas-microsoft-com:office:word" xmlns:w="http://schemas.openxmlformats.org/wordprocessingml/2006/main" xmlns:w14="http://schemas.microsoft.com/office/word/2010/wordml" xmlns:w15="http://schemas.microsoft.com/office/word/2012/wordml" xmlns:w16cex="http://schemas.microsoft.com/office/word/2018/wordml/cex" xmlns:w16cid="http://schemas.microsoft.com/office/word/2016/wordml/cid" xmlns:w16="http://schemas.microsoft.com/office/word/2018/wordml" xmlns:w16du="http://schemas.microsoft.com/office/word/2023/wordml/word16du" xmlns:w16sdtdh="http://schemas.microsoft.com/office/word/2020/wordml/sdtdatahash" xmlns:w16se="http://schemas.microsoft.com/office/word/2015/wordml/symex" xmlns:wpg="http://schemas.microsoft.com/office/word/2010/wordprocessingGroup" xmlns:wpi="http://schemas.microsoft.com/office/word/2010/wordprocessingInk" xmlns:wne="http://schemas.microsoft.com/office/word/2006/wordml" xmlns:wps="http://schemas.microsoft.com/office/word/2010/wordprocessingShape" mc:Ignorable="w14 w15 w16se w16cid w16 w16cex w16sdtdh w16du wp14">
+<w:document xmlns:a="http://schemas.openxmlformats.org/drawingml/2006/main" xmlns:pic="http://schemas.openxmlformats.org/drawingml/2006/picture" xmlns:wpc="http://schemas.microsoft.com/office/word/2010/wordprocessingCanvas" xmlns:cx="http://schemas.microsoft.com/office/drawing/2014/chartex" xmlns:cx1="http://schemas.microsoft.com/office/drawing/2015/9/8/chartex" xmlns:cx2="http://schemas.microsoft.com/office/drawing/2015/10/21/chartex" xmlns:cx3="http://schemas.microsoft.com/office/drawing/2016/5/9/chartex" xmlns:cx4="http://schemas.microsoft.com/office/drawing/2016/5/10/chartex" xmlns:cx5="http://schemas.microsoft.com/office/drawing/2016/5/11/chartex" xmlns:cx6="http://schemas.microsoft.com/office/drawing/2016/5/12/chartex" xmlns:cx7="http://schemas.microsoft.com/office/drawing/2016/5/13/chartex" xmlns:cx8="http://schemas.microsoft.com/office/drawing/2016/5/14/chartex" xmlns:mc="http://schemas.openxmlformats.org/markup-compatibility/2006" xmlns:aink="http://schemas.microsoft.com/office/drawing/2016/ink" xmlns:am3d="http://schemas.microsoft.com/office/drawing/2017/model3d" xmlns:o="urn:schemas-microsoft-com:office:office" xmlns:oel="http://schemas.microsoft.com/office/2019/extlst" xmlns:r="http://schemas.openxmlformats.org/officeDocument/2006/relationships" xmlns:m="http://schemas.openxmlformats.org/officeDocument/2006/math" xmlns:v="urn:schemas-microsoft-com:vml" xmlns:wp14="http://schemas.microsoft.com/office/word/2010/wordprocessingDrawing" xmlns:wp="http://schemas.openxmlformats.org/drawingml/2006/wordprocessingDrawing" xmlns:w10="urn:schemas-microsoft-com:office:word" xmlns:w="http://schemas.openxmlformats.org/wordprocessingml/2006/main" xmlns:w14="http://schemas.microsoft.com/office/word/2010/wordml" xmlns:w15="http://schemas.microsoft.com/office/word/2012/wordml" xmlns:w16cex="http://schemas.microsoft.com/office/word/2018/wordml/cex" xmlns:w16cid="http://schemas.microsoft.com/office/word/2016/wordml/cid" xmlns:w16="http://schemas.microsoft.com/office/word/2018/wordml" xmlns:w16du="http://schemas.microsoft.com/office/word/2023/wordml/word16du" xmlns:w16sdtdh="http://schemas.microsoft.com/office/word/2020/wordml/sdtdatahash" xmlns:w16sdtfl="http://schemas.microsoft.com/office/word/2024/wordml/sdtformatlock" xmlns:w16se="http://schemas.microsoft.com/office/word/2015/wordml/symex" xmlns:wpg="http://schemas.microsoft.com/office/word/2010/wordprocessingGroup" xmlns:wpi="http://schemas.microsoft.com/office/word/2010/wordprocessingInk" xmlns:wne="http://schemas.microsoft.com/office/word/2006/wordml" xmlns:wps="http://schemas.microsoft.com/office/word/2010/wordprocessingShape" mc:Ignorable="w14 w15 w16se w16cid w16 w16cex w16sdtdh w16sdtfl w16du wp14">
   <w:body>
     <w:tbl>
       <w:tblPr>
@@ -78,6 +78,7 @@
                       </w:tcBorders>
                     </w:tcPr>
                     <w:p>
+                      <w:proofErr w:type="spellStart"/>
                       <w:r>
                         <w:rPr>
                           <w:b/>
@@ -87,6 +88,7 @@
                         </w:rPr>
                         <w:t>CompanyName</w:t>
                       </w:r>
+                      <w:proofErr w:type="spellEnd"/>
                     </w:p>
                   </w:tc>
                 </w:sdtContent>
@@ -146,9 +148,11 @@
                       </w:tcBorders>
                     </w:tcPr>
                     <w:p>
+                      <w:proofErr w:type="spellStart"/>
                       <w:r>
                         <w:t>CompanyAddress</w:t>
                       </w:r>
+                      <w:proofErr w:type="spellEnd"/>
                     </w:p>
                   </w:tc>
                 </w:sdtContent>
@@ -253,6 +257,7 @@
                       <w:text/>
                     </w:sdtPr>
                     <w:sdtContent>
+                      <w:proofErr w:type="spellStart"/>
                       <w:r>
                         <w:t>CompanyCity</w:t>
                       </w:r>
@@ -276,6 +281,7 @@
                       <w:r>
                         <w:t>CompanyPostcode</w:t>
                       </w:r>
+                      <w:proofErr w:type="spellEnd"/>
                     </w:sdtContent>
                   </w:sdt>
                   <w:r>
@@ -284,6 +290,7 @@
                   <w:r>
                     <w:t>,</w:t>
                   </w:r>
+                  <w:proofErr w:type="spellStart"/>
                   <w:sdt>
                     <w:sdtPr>
                       <w:alias w:val="#Nav: /Payment_Mode2/CompanyCountry"/>
@@ -299,6 +306,7 @@
                       <w:r>
                         <w:t>CompanyCountry</w:t>
                       </w:r>
+                      <w:proofErr w:type="spellEnd"/>
                     </w:sdtContent>
                   </w:sdt>
                 </w:p>
@@ -345,9 +353,11 @@
                       <w:text/>
                     </w:sdtPr>
                     <w:sdtContent>
+                      <w:proofErr w:type="spellStart"/>
                       <w:r>
                         <w:t>CompanyPhone</w:t>
                       </w:r>
+                      <w:proofErr w:type="spellEnd"/>
                     </w:sdtContent>
                   </w:sdt>
                 </w:p>
@@ -394,9 +404,11 @@
                       <w:text/>
                     </w:sdtPr>
                     <w:sdtContent>
+                      <w:proofErr w:type="spellStart"/>
                       <w:r>
                         <w:t>CompanyEmail</w:t>
                       </w:r>
+                      <w:proofErr w:type="spellEnd"/>
                     </w:sdtContent>
                   </w:sdt>
                 </w:p>
@@ -446,9 +458,11 @@
                       <w:text/>
                     </w:sdtPr>
                     <w:sdtContent>
+                      <w:proofErr w:type="spellStart"/>
                       <w:r>
                         <w:t>CompanyTRN</w:t>
                       </w:r>
+                      <w:proofErr w:type="spellEnd"/>
                     </w:sdtContent>
                   </w:sdt>
                 </w:p>
@@ -495,14 +509,14 @@
                   </w:r>
                   <w:sdt>
                     <w:sdtPr>
+                      <w:alias w:val="#Nav: /Payment_Mode2/Receipt__"/>
+                      <w:tag w:val="#Nav: PaymentReceipt/50112"/>
                       <w:id w:val="837121487"/>
                       <w:placeholder>
                         <w:docPart w:val="DefaultPlaceholder_-1854013440"/>
                       </w:placeholder>
                       <w:dataBinding w:prefixMappings="xmlns:ns0='urn:microsoft-dynamics-nav/reports/PaymentReceipt/50112/' " w:xpath="/ns0:NavWordReportXmlPart[1]/ns0:Payment_Mode2[1]/ns0:Receipt__[1]" w:storeItemID="{072A5C88-FD1B-4274-ACD9-2C46D19524E4}"/>
                       <w:text/>
-                      <w:alias w:val="#Nav: /Payment_Mode2/Receipt__"/>
-                      <w:tag w:val="#Nav: PaymentReceipt/50112"/>
                     </w:sdtPr>
                     <w:sdtContent>
                       <w:r>
@@ -544,9 +558,11 @@
                       <w:text/>
                     </w:sdtPr>
                     <w:sdtContent>
+                      <w:proofErr w:type="spellStart"/>
                       <w:r>
                         <w:t>CurrentDate</w:t>
                       </w:r>
+                      <w:proofErr w:type="spellEnd"/>
                     </w:sdtContent>
                   </w:sdt>
                 </w:p>
@@ -635,9 +651,11 @@
                       </w:tcBorders>
                     </w:tcPr>
                     <w:p>
+                      <w:proofErr w:type="spellStart"/>
                       <w:r>
                         <w:t>Tenant_Name</w:t>
                       </w:r>
+                      <w:proofErr w:type="spellEnd"/>
                     </w:p>
                   </w:tc>
                 </w:sdtContent>
@@ -666,9 +684,11 @@
                       <w:text/>
                     </w:sdtPr>
                     <w:sdtContent>
+                      <w:proofErr w:type="spellStart"/>
                       <w:r>
                         <w:t>Contract_ID</w:t>
                       </w:r>
+                      <w:proofErr w:type="spellEnd"/>
                     </w:sdtContent>
                   </w:sdt>
                 </w:p>
@@ -732,9 +752,11 @@
                       <w:text/>
                     </w:sdtPr>
                     <w:sdtContent>
+                      <w:proofErr w:type="spellStart"/>
                       <w:r>
                         <w:t>Property_Name</w:t>
                       </w:r>
+                      <w:proofErr w:type="spellEnd"/>
                     </w:sdtContent>
                   </w:sdt>
                 </w:p>
@@ -769,8 +791,13 @@
                       <w:text/>
                     </w:sdtPr>
                     <w:sdtContent>
+                      <w:proofErr w:type="spellStart"/>
                       <w:r>
-                        <w:t>Phone_No_</w:t>
+                        <w:t>Phone_No</w:t>
+                      </w:r>
+                      <w:proofErr w:type="spellEnd"/>
+                      <w:r>
+                        <w:t>_</w:t>
                       </w:r>
                     </w:sdtContent>
                   </w:sdt>
@@ -801,9 +828,11 @@
                       <w:text/>
                     </w:sdtPr>
                     <w:sdtContent>
+                      <w:proofErr w:type="spellStart"/>
                       <w:r>
                         <w:t>Unit_Name</w:t>
                       </w:r>
+                      <w:proofErr w:type="spellEnd"/>
                     </w:sdtContent>
                   </w:sdt>
                 </w:p>
@@ -838,9 +867,11 @@
                       <w:text/>
                     </w:sdtPr>
                     <w:sdtContent>
+                      <w:proofErr w:type="spellStart"/>
                       <w:r>
                         <w:t>Tenant_Email</w:t>
                       </w:r>
+                      <w:proofErr w:type="spellEnd"/>
                     </w:sdtContent>
                   </w:sdt>
                 </w:p>
@@ -870,9 +901,11 @@
                       <w:text/>
                     </w:sdtPr>
                     <w:sdtContent>
+                      <w:proofErr w:type="spellStart"/>
                       <w:r>
                         <w:t>Contract_Start_Date</w:t>
                       </w:r>
+                      <w:proofErr w:type="spellEnd"/>
                     </w:sdtContent>
                   </w:sdt>
                   <w:r>
@@ -890,9 +923,11 @@
                       <w:text/>
                     </w:sdtPr>
                     <w:sdtContent>
+                      <w:proofErr w:type="spellStart"/>
                       <w:r>
                         <w:t>Contract_End_Date</w:t>
                       </w:r>
+                      <w:proofErr w:type="spellEnd"/>
                     </w:sdtContent>
                   </w:sdt>
                 </w:p>
@@ -926,9 +961,11 @@
                       <w:text/>
                     </w:sdtPr>
                     <w:sdtContent>
+                      <w:proofErr w:type="spellStart"/>
                       <w:r>
                         <w:t>Cus_TRN</w:t>
                       </w:r>
+                      <w:proofErr w:type="spellEnd"/>
                     </w:sdtContent>
                   </w:sdt>
                 </w:p>
@@ -957,9 +994,11 @@
                       <w:text/>
                     </w:sdtPr>
                     <w:sdtContent>
+                      <w:proofErr w:type="spellStart"/>
                       <w:r>
                         <w:t>Contract_Tenor</w:t>
                       </w:r>
+                      <w:proofErr w:type="spellEnd"/>
                     </w:sdtContent>
                   </w:sdt>
                 </w:p>
@@ -1197,40 +1236,45 @@
                       <w:trPr>
                         <w:trHeight w:val="250"/>
                       </w:trPr>
+                      <w:tc>
+                        <w:tcPr>
+                          <w:tcW w:w="1020" w:type="dxa"/>
+                        </w:tcPr>
+                        <w:p>
+                          <w:sdt>
+                            <w:sdtPr>
+                              <w:id w:val="530459479"/>
+                              <w:placeholder>
+                                <w:docPart w:val="DefaultPlaceholder_-1854013440"/>
+                              </w:placeholder>
+                              <w:dataBinding w:prefixMappings="xmlns:ns0='urn:microsoft-dynamics-nav/reports/PaymentReceipt/50112/' " w:xpath="/ns0:NavWordReportXmlPart[1]/ns0:Payment_Mode2[1]/ns0:Payment_Schedule2[1]/ns0:Pay_S[1]" w:storeItemID="{072A5C88-FD1B-4274-ACD9-2C46D19524E4}"/>
+                              <w:text/>
+                              <w:alias w:val="#Nav: /Payment_Mode2/Payment_Schedule2/Pay_S"/>
+                              <w:tag w:val="#Nav: PaymentReceipt/50112"/>
+                            </w:sdtPr>
+                            <w:sdtContent>
+                              <w:proofErr w:type="spellStart"/>
+                              <w:r>
+                                <w:t>Pay_S</w:t>
+                              </w:r>
+                              <w:proofErr w:type="spellEnd"/>
+                            </w:sdtContent>
+                          </w:sdt>
+                          <w:r>
+                            <w:t xml:space="preserve"> </w:t>
+                          </w:r>
+                        </w:p>
+                      </w:tc>
                       <w:sdt>
                         <w:sdtPr>
-                          <w:alias w:val="#Nav: /Payment_Mode2/Payment_Schedule2/Pay_S"/>
-                          <w:tag w:val="#Nav: PaymentReceipt/50112"/>
-                          <w:id w:val="1502464620"/>
+                          <w:id w:val="-1526708678"/>
                           <w:placeholder>
                             <w:docPart w:val="DefaultPlaceholder_-1854013440"/>
                           </w:placeholder>
-                          <w:dataBinding w:prefixMappings="xmlns:ns0='urn:microsoft-dynamics-nav/reports/PaymentReceipt/50112/'" w:xpath="/ns0:NavWordReportXmlPart[1]/ns0:Payment_Mode2[1]/ns0:Payment_Schedule2[1]/ns0:Pay_S[1]" w:storeItemID="{072A5C88-FD1B-4274-ACD9-2C46D19524E4}"/>
+                          <w:dataBinding w:prefixMappings="xmlns:ns0='urn:microsoft-dynamics-nav/reports/PaymentReceipt/50112/' " w:xpath="/ns0:NavWordReportXmlPart[1]/ns0:Payment_Mode2[1]/ns0:Payment_Schedule2[1]/ns0:I_ID[1]" w:storeItemID="{072A5C88-FD1B-4274-ACD9-2C46D19524E4}"/>
                           <w:text/>
-                        </w:sdtPr>
-                        <w:sdtContent>
-                          <w:tc>
-                            <w:tcPr>
-                              <w:tcW w:w="1020" w:type="dxa"/>
-                            </w:tcPr>
-                            <w:p>
-                              <w:r>
-                                <w:t>Pay_S</w:t>
-                              </w:r>
-                            </w:p>
-                          </w:tc>
-                        </w:sdtContent>
-                      </w:sdt>
-                      <w:sdt>
-                        <w:sdtPr>
                           <w:alias w:val="#Nav: /Payment_Mode2/Payment_Schedule2/I_ID"/>
                           <w:tag w:val="#Nav: PaymentReceipt/50112"/>
-                          <w:id w:val="2024972826"/>
-                          <w:placeholder>
-                            <w:docPart w:val="DefaultPlaceholder_-1854013440"/>
-                          </w:placeholder>
-                          <w:dataBinding w:prefixMappings="xmlns:ns0='urn:microsoft-dynamics-nav/reports/PaymentReceipt/50112/'" w:xpath="/ns0:NavWordReportXmlPart[1]/ns0:Payment_Mode2[1]/ns0:Payment_Schedule2[1]/ns0:I_ID[1]" w:storeItemID="{072A5C88-FD1B-4274-ACD9-2C46D19524E4}"/>
-                          <w:text/>
                         </w:sdtPr>
                         <w:sdtContent>
                           <w:tc>
@@ -1262,23 +1306,25 @@
                               <w:tcW w:w="3402" w:type="dxa"/>
                             </w:tcPr>
                             <w:p>
+                              <w:proofErr w:type="spellStart"/>
                               <w:r>
                                 <w:t>Secondary_Item_Type</w:t>
                               </w:r>
+                              <w:proofErr w:type="spellEnd"/>
                             </w:p>
                           </w:tc>
                         </w:sdtContent>
                       </w:sdt>
                       <w:sdt>
                         <w:sdtPr>
-                          <w:alias w:val="#Nav: /Payment_Mode2/Payment_Schedule2/Pay_M"/>
-                          <w:tag w:val="#Nav: PaymentReceipt/50112"/>
-                          <w:id w:val="2059120581"/>
+                          <w:id w:val="-1825272108"/>
                           <w:placeholder>
                             <w:docPart w:val="DefaultPlaceholder_-1854013440"/>
                           </w:placeholder>
-                          <w:dataBinding w:prefixMappings="xmlns:ns0='urn:microsoft-dynamics-nav/reports/PaymentReceipt/50112/'" w:xpath="/ns0:NavWordReportXmlPart[1]/ns0:Payment_Mode2[1]/ns0:Payment_Schedule2[1]/ns0:Pay_M[1]" w:storeItemID="{072A5C88-FD1B-4274-ACD9-2C46D19524E4}"/>
+                          <w:dataBinding w:prefixMappings="xmlns:ns0='urn:microsoft-dynamics-nav/reports/PaymentReceipt/50112/' " w:xpath="/ns0:NavWordReportXmlPart[1]/ns0:Payment_Mode2[1]/ns0:Payment_Schedule2[1]/ns0:Pay_M[1]" w:storeItemID="{072A5C88-FD1B-4274-ACD9-2C46D19524E4}"/>
                           <w:text/>
+                          <w:alias w:val="#Nav: /Payment_Mode2/Payment_Schedule2/Pay_M"/>
+                          <w:tag w:val="#Nav: PaymentReceipt/50112"/>
                         </w:sdtPr>
                         <w:sdtContent>
                           <w:tc>
@@ -1286,23 +1332,25 @@
                               <w:tcW w:w="1843" w:type="dxa"/>
                             </w:tcPr>
                             <w:p>
+                              <w:proofErr w:type="spellStart"/>
                               <w:r>
                                 <w:t>Pay_M</w:t>
                               </w:r>
+                              <w:proofErr w:type="spellEnd"/>
                             </w:p>
                           </w:tc>
                         </w:sdtContent>
                       </w:sdt>
                       <w:sdt>
                         <w:sdtPr>
-                          <w:alias w:val="#Nav: /Payment_Mode2/Payment_Schedule2/Che_N"/>
-                          <w:tag w:val="#Nav: PaymentReceipt/50112"/>
-                          <w:id w:val="-2016597163"/>
+                          <w:id w:val="-2133770087"/>
                           <w:placeholder>
                             <w:docPart w:val="DefaultPlaceholder_-1854013440"/>
                           </w:placeholder>
-                          <w:dataBinding w:prefixMappings="xmlns:ns0='urn:microsoft-dynamics-nav/reports/PaymentReceipt/50112/'" w:xpath="/ns0:NavWordReportXmlPart[1]/ns0:Payment_Mode2[1]/ns0:Payment_Schedule2[1]/ns0:Che_N[1]" w:storeItemID="{072A5C88-FD1B-4274-ACD9-2C46D19524E4}"/>
+                          <w:dataBinding w:prefixMappings="xmlns:ns0='urn:microsoft-dynamics-nav/reports/PaymentReceipt/50112/' " w:xpath="/ns0:NavWordReportXmlPart[1]/ns0:Payment_Mode2[1]/ns0:Payment_Schedule2[1]/ns0:Che_N[1]" w:storeItemID="{072A5C88-FD1B-4274-ACD9-2C46D19524E4}"/>
                           <w:text/>
+                          <w:alias w:val="#Nav: /Payment_Mode2/Payment_Schedule2/Che_N"/>
+                          <w:tag w:val="#Nav: PaymentReceipt/50112"/>
                         </w:sdtPr>
                         <w:sdtContent>
                           <w:tc>
@@ -1310,9 +1358,11 @@
                               <w:tcW w:w="1276" w:type="dxa"/>
                             </w:tcPr>
                             <w:p>
+                              <w:proofErr w:type="spellStart"/>
                               <w:r>
                                 <w:t>Che_N</w:t>
                               </w:r>
+                              <w:proofErr w:type="spellEnd"/>
                             </w:p>
                           </w:tc>
                         </w:sdtContent>
@@ -1644,9 +1694,11 @@
                           <w:bCs/>
                         </w:rPr>
                       </w:pPr>
+                      <w:proofErr w:type="spellStart"/>
                       <w:r>
                         <w:t>AmountInWords</w:t>
                       </w:r>
+                      <w:proofErr w:type="spellEnd"/>
                     </w:p>
                   </w:sdtContent>
                 </w:sdt>
@@ -1688,7 +1740,7 @@
 </file>
 
 <file path=word/endnotes.xml><?xml version="1.0" encoding="utf-8"?>
-<w:endnotes xmlns:wpc="http://schemas.microsoft.com/office/word/2010/wordprocessingCanvas" xmlns:cx="http://schemas.microsoft.com/office/drawing/2014/chartex" xmlns:cx1="http://schemas.microsoft.com/office/drawing/2015/9/8/chartex" xmlns:cx2="http://schemas.microsoft.com/office/drawing/2015/10/21/chartex" xmlns:cx3="http://schemas.microsoft.com/office/drawing/2016/5/9/chartex" xmlns:cx4="http://schemas.microsoft.com/office/drawing/2016/5/10/chartex" xmlns:cx5="http://schemas.microsoft.com/office/drawing/2016/5/11/chartex" xmlns:cx6="http://schemas.microsoft.com/office/drawing/2016/5/12/chartex" xmlns:cx7="http://schemas.microsoft.com/office/drawing/2016/5/13/chartex" xmlns:cx8="http://schemas.microsoft.com/office/drawing/2016/5/14/chartex" xmlns:mc="http://schemas.openxmlformats.org/markup-compatibility/2006" xmlns:aink="http://schemas.microsoft.com/office/drawing/2016/ink" xmlns:am3d="http://schemas.microsoft.com/office/drawing/2017/model3d" xmlns:o="urn:schemas-microsoft-com:office:office" xmlns:oel="http://schemas.microsoft.com/office/2019/extlst" xmlns:r="http://schemas.openxmlformats.org/officeDocument/2006/relationships" xmlns:m="http://schemas.openxmlformats.org/officeDocument/2006/math" xmlns:v="urn:schemas-microsoft-com:vml" xmlns:wp14="http://schemas.microsoft.com/office/word/2010/wordprocessingDrawing" xmlns:wp="http://schemas.openxmlformats.org/drawingml/2006/wordprocessingDrawing" xmlns:w10="urn:schemas-microsoft-com:office:word" xmlns:w="http://schemas.openxmlformats.org/wordprocessingml/2006/main" xmlns:w14="http://schemas.microsoft.com/office/word/2010/wordml" xmlns:w15="http://schemas.microsoft.com/office/word/2012/wordml" xmlns:w16cex="http://schemas.microsoft.com/office/word/2018/wordml/cex" xmlns:w16cid="http://schemas.microsoft.com/office/word/2016/wordml/cid" xmlns:w16="http://schemas.microsoft.com/office/word/2018/wordml" xmlns:w16du="http://schemas.microsoft.com/office/word/2023/wordml/word16du" xmlns:w16sdtdh="http://schemas.microsoft.com/office/word/2020/wordml/sdtdatahash" xmlns:w16se="http://schemas.microsoft.com/office/word/2015/wordml/symex" xmlns:wpg="http://schemas.microsoft.com/office/word/2010/wordprocessingGroup" xmlns:wpi="http://schemas.microsoft.com/office/word/2010/wordprocessingInk" xmlns:wne="http://schemas.microsoft.com/office/word/2006/wordml" xmlns:wps="http://schemas.microsoft.com/office/word/2010/wordprocessingShape" mc:Ignorable="w14 w15 w16se w16cid w16 w16cex w16sdtdh w16du wp14">
+<w:endnotes xmlns:wpc="http://schemas.microsoft.com/office/word/2010/wordprocessingCanvas" xmlns:cx="http://schemas.microsoft.com/office/drawing/2014/chartex" xmlns:cx1="http://schemas.microsoft.com/office/drawing/2015/9/8/chartex" xmlns:cx2="http://schemas.microsoft.com/office/drawing/2015/10/21/chartex" xmlns:cx3="http://schemas.microsoft.com/office/drawing/2016/5/9/chartex" xmlns:cx4="http://schemas.microsoft.com/office/drawing/2016/5/10/chartex" xmlns:cx5="http://schemas.microsoft.com/office/drawing/2016/5/11/chartex" xmlns:cx6="http://schemas.microsoft.com/office/drawing/2016/5/12/chartex" xmlns:cx7="http://schemas.microsoft.com/office/drawing/2016/5/13/chartex" xmlns:cx8="http://schemas.microsoft.com/office/drawing/2016/5/14/chartex" xmlns:mc="http://schemas.openxmlformats.org/markup-compatibility/2006" xmlns:aink="http://schemas.microsoft.com/office/drawing/2016/ink" xmlns:am3d="http://schemas.microsoft.com/office/drawing/2017/model3d" xmlns:o="urn:schemas-microsoft-com:office:office" xmlns:oel="http://schemas.microsoft.com/office/2019/extlst" xmlns:r="http://schemas.openxmlformats.org/officeDocument/2006/relationships" xmlns:m="http://schemas.openxmlformats.org/officeDocument/2006/math" xmlns:v="urn:schemas-microsoft-com:vml" xmlns:wp14="http://schemas.microsoft.com/office/word/2010/wordprocessingDrawing" xmlns:wp="http://schemas.openxmlformats.org/drawingml/2006/wordprocessingDrawing" xmlns:w10="urn:schemas-microsoft-com:office:word" xmlns:w="http://schemas.openxmlformats.org/wordprocessingml/2006/main" xmlns:w14="http://schemas.microsoft.com/office/word/2010/wordml" xmlns:w15="http://schemas.microsoft.com/office/word/2012/wordml" xmlns:w16cex="http://schemas.microsoft.com/office/word/2018/wordml/cex" xmlns:w16cid="http://schemas.microsoft.com/office/word/2016/wordml/cid" xmlns:w16="http://schemas.microsoft.com/office/word/2018/wordml" xmlns:w16du="http://schemas.microsoft.com/office/word/2023/wordml/word16du" xmlns:w16sdtdh="http://schemas.microsoft.com/office/word/2020/wordml/sdtdatahash" xmlns:w16sdtfl="http://schemas.microsoft.com/office/word/2024/wordml/sdtformatlock" xmlns:w16se="http://schemas.microsoft.com/office/word/2015/wordml/symex" xmlns:wpg="http://schemas.microsoft.com/office/word/2010/wordprocessingGroup" xmlns:wpi="http://schemas.microsoft.com/office/word/2010/wordprocessingInk" xmlns:wne="http://schemas.microsoft.com/office/word/2006/wordml" xmlns:wps="http://schemas.microsoft.com/office/word/2010/wordprocessingShape" mc:Ignorable="w14 w15 w16se w16cid w16 w16cex w16sdtdh w16sdtfl w16du wp14">
   <w:endnote w:type="separator" w:id="-1">
     <w:p>
       <w:pPr>
@@ -1713,7 +1765,7 @@
 </file>
 
 <file path=word/footnotes.xml><?xml version="1.0" encoding="utf-8"?>
-<w:footnotes xmlns:wpc="http://schemas.microsoft.com/office/word/2010/wordprocessingCanvas" xmlns:cx="http://schemas.microsoft.com/office/drawing/2014/chartex" xmlns:cx1="http://schemas.microsoft.com/office/drawing/2015/9/8/chartex" xmlns:cx2="http://schemas.microsoft.com/office/drawing/2015/10/21/chartex" xmlns:cx3="http://schemas.microsoft.com/office/drawing/2016/5/9/chartex" xmlns:cx4="http://schemas.microsoft.com/office/drawing/2016/5/10/chartex" xmlns:cx5="http://schemas.microsoft.com/office/drawing/2016/5/11/chartex" xmlns:cx6="http://schemas.microsoft.com/office/drawing/2016/5/12/chartex" xmlns:cx7="http://schemas.microsoft.com/office/drawing/2016/5/13/chartex" xmlns:cx8="http://schemas.microsoft.com/office/drawing/2016/5/14/chartex" xmlns:mc="http://schemas.openxmlformats.org/markup-compatibility/2006" xmlns:aink="http://schemas.microsoft.com/office/drawing/2016/ink" xmlns:am3d="http://schemas.microsoft.com/office/drawing/2017/model3d" xmlns:o="urn:schemas-microsoft-com:office:office" xmlns:oel="http://schemas.microsoft.com/office/2019/extlst" xmlns:r="http://schemas.openxmlformats.org/officeDocument/2006/relationships" xmlns:m="http://schemas.openxmlformats.org/officeDocument/2006/math" xmlns:v="urn:schemas-microsoft-com:vml" xmlns:wp14="http://schemas.microsoft.com/office/word/2010/wordprocessingDrawing" xmlns:wp="http://schemas.openxmlformats.org/drawingml/2006/wordprocessingDrawing" xmlns:w10="urn:schemas-microsoft-com:office:word" xmlns:w="http://schemas.openxmlformats.org/wordprocessingml/2006/main" xmlns:w14="http://schemas.microsoft.com/office/word/2010/wordml" xmlns:w15="http://schemas.microsoft.com/office/word/2012/wordml" xmlns:w16cex="http://schemas.microsoft.com/office/word/2018/wordml/cex" xmlns:w16cid="http://schemas.microsoft.com/office/word/2016/wordml/cid" xmlns:w16="http://schemas.microsoft.com/office/word/2018/wordml" xmlns:w16du="http://schemas.microsoft.com/office/word/2023/wordml/word16du" xmlns:w16sdtdh="http://schemas.microsoft.com/office/word/2020/wordml/sdtdatahash" xmlns:w16se="http://schemas.microsoft.com/office/word/2015/wordml/symex" xmlns:wpg="http://schemas.microsoft.com/office/word/2010/wordprocessingGroup" xmlns:wpi="http://schemas.microsoft.com/office/word/2010/wordprocessingInk" xmlns:wne="http://schemas.microsoft.com/office/word/2006/wordml" xmlns:wps="http://schemas.microsoft.com/office/word/2010/wordprocessingShape" mc:Ignorable="w14 w15 w16se w16cid w16 w16cex w16sdtdh w16du wp14">
+<w:footnotes xmlns:wpc="http://schemas.microsoft.com/office/word/2010/wordprocessingCanvas" xmlns:cx="http://schemas.microsoft.com/office/drawing/2014/chartex" xmlns:cx1="http://schemas.microsoft.com/office/drawing/2015/9/8/chartex" xmlns:cx2="http://schemas.microsoft.com/office/drawing/2015/10/21/chartex" xmlns:cx3="http://schemas.microsoft.com/office/drawing/2016/5/9/chartex" xmlns:cx4="http://schemas.microsoft.com/office/drawing/2016/5/10/chartex" xmlns:cx5="http://schemas.microsoft.com/office/drawing/2016/5/11/chartex" xmlns:cx6="http://schemas.microsoft.com/office/drawing/2016/5/12/chartex" xmlns:cx7="http://schemas.microsoft.com/office/drawing/2016/5/13/chartex" xmlns:cx8="http://schemas.microsoft.com/office/drawing/2016/5/14/chartex" xmlns:mc="http://schemas.openxmlformats.org/markup-compatibility/2006" xmlns:aink="http://schemas.microsoft.com/office/drawing/2016/ink" xmlns:am3d="http://schemas.microsoft.com/office/drawing/2017/model3d" xmlns:o="urn:schemas-microsoft-com:office:office" xmlns:oel="http://schemas.microsoft.com/office/2019/extlst" xmlns:r="http://schemas.openxmlformats.org/officeDocument/2006/relationships" xmlns:m="http://schemas.openxmlformats.org/officeDocument/2006/math" xmlns:v="urn:schemas-microsoft-com:vml" xmlns:wp14="http://schemas.microsoft.com/office/word/2010/wordprocessingDrawing" xmlns:wp="http://schemas.openxmlformats.org/drawingml/2006/wordprocessingDrawing" xmlns:w10="urn:schemas-microsoft-com:office:word" xmlns:w="http://schemas.openxmlformats.org/wordprocessingml/2006/main" xmlns:w14="http://schemas.microsoft.com/office/word/2010/wordml" xmlns:w15="http://schemas.microsoft.com/office/word/2012/wordml" xmlns:w16cex="http://schemas.microsoft.com/office/word/2018/wordml/cex" xmlns:w16cid="http://schemas.microsoft.com/office/word/2016/wordml/cid" xmlns:w16="http://schemas.microsoft.com/office/word/2018/wordml" xmlns:w16du="http://schemas.microsoft.com/office/word/2023/wordml/word16du" xmlns:w16sdtdh="http://schemas.microsoft.com/office/word/2020/wordml/sdtdatahash" xmlns:w16sdtfl="http://schemas.microsoft.com/office/word/2024/wordml/sdtformatlock" xmlns:w16se="http://schemas.microsoft.com/office/word/2015/wordml/symex" xmlns:wpg="http://schemas.microsoft.com/office/word/2010/wordprocessingGroup" xmlns:wpi="http://schemas.microsoft.com/office/word/2010/wordprocessingInk" xmlns:wne="http://schemas.microsoft.com/office/word/2006/wordml" xmlns:wps="http://schemas.microsoft.com/office/word/2010/wordprocessingShape" mc:Ignorable="w14 w15 w16se w16cid w16 w16cex w16sdtdh w16sdtfl w16du wp14">
   <w:footnote w:type="separator" w:id="-1">
     <w:p>
       <w:pPr>
@@ -1738,7 +1790,7 @@
 </file>
 
 <file path=word/header1.xml><?xml version="1.0" encoding="utf-8"?>
-<w:hdr xmlns:a="http://schemas.openxmlformats.org/drawingml/2006/main" xmlns:wpc="http://schemas.microsoft.com/office/word/2010/wordprocessingCanvas" xmlns:cx="http://schemas.microsoft.com/office/drawing/2014/chartex" xmlns:cx1="http://schemas.microsoft.com/office/drawing/2015/9/8/chartex" xmlns:cx2="http://schemas.microsoft.com/office/drawing/2015/10/21/chartex" xmlns:cx3="http://schemas.microsoft.com/office/drawing/2016/5/9/chartex" xmlns:cx4="http://schemas.microsoft.com/office/drawing/2016/5/10/chartex" xmlns:cx5="http://schemas.microsoft.com/office/drawing/2016/5/11/chartex" xmlns:cx6="http://schemas.microsoft.com/office/drawing/2016/5/12/chartex" xmlns:cx7="http://schemas.microsoft.com/office/drawing/2016/5/13/chartex" xmlns:cx8="http://schemas.microsoft.com/office/drawing/2016/5/14/chartex" xmlns:mc="http://schemas.openxmlformats.org/markup-compatibility/2006" xmlns:aink="http://schemas.microsoft.com/office/drawing/2016/ink" xmlns:am3d="http://schemas.microsoft.com/office/drawing/2017/model3d" xmlns:o="urn:schemas-microsoft-com:office:office" xmlns:oel="http://schemas.microsoft.com/office/2019/extlst" xmlns:r="http://schemas.openxmlformats.org/officeDocument/2006/relationships" xmlns:m="http://schemas.openxmlformats.org/officeDocument/2006/math" xmlns:v="urn:schemas-microsoft-com:vml" xmlns:wp14="http://schemas.microsoft.com/office/word/2010/wordprocessingDrawing" xmlns:wp="http://schemas.openxmlformats.org/drawingml/2006/wordprocessingDrawing" xmlns:w10="urn:schemas-microsoft-com:office:word" xmlns:w="http://schemas.openxmlformats.org/wordprocessingml/2006/main" xmlns:w14="http://schemas.microsoft.com/office/word/2010/wordml" xmlns:w15="http://schemas.microsoft.com/office/word/2012/wordml" xmlns:w16cex="http://schemas.microsoft.com/office/word/2018/wordml/cex" xmlns:w16cid="http://schemas.microsoft.com/office/word/2016/wordml/cid" xmlns:w16="http://schemas.microsoft.com/office/word/2018/wordml" xmlns:w16du="http://schemas.microsoft.com/office/word/2023/wordml/word16du" xmlns:w16sdtdh="http://schemas.microsoft.com/office/word/2020/wordml/sdtdatahash" xmlns:w16se="http://schemas.microsoft.com/office/word/2015/wordml/symex" xmlns:wpg="http://schemas.microsoft.com/office/word/2010/wordprocessingGroup" xmlns:wpi="http://schemas.microsoft.com/office/word/2010/wordprocessingInk" xmlns:wne="http://schemas.microsoft.com/office/word/2006/wordml" xmlns:wps="http://schemas.microsoft.com/office/word/2010/wordprocessingShape" mc:Ignorable="w14 w15 w16se w16cid w16 w16cex w16sdtdh w16du wp14">
+<w:hdr xmlns:a="http://schemas.openxmlformats.org/drawingml/2006/main" xmlns:wpc="http://schemas.microsoft.com/office/word/2010/wordprocessingCanvas" xmlns:cx="http://schemas.microsoft.com/office/drawing/2014/chartex" xmlns:cx1="http://schemas.microsoft.com/office/drawing/2015/9/8/chartex" xmlns:cx2="http://schemas.microsoft.com/office/drawing/2015/10/21/chartex" xmlns:cx3="http://schemas.microsoft.com/office/drawing/2016/5/9/chartex" xmlns:cx4="http://schemas.microsoft.com/office/drawing/2016/5/10/chartex" xmlns:cx5="http://schemas.microsoft.com/office/drawing/2016/5/11/chartex" xmlns:cx6="http://schemas.microsoft.com/office/drawing/2016/5/12/chartex" xmlns:cx7="http://schemas.microsoft.com/office/drawing/2016/5/13/chartex" xmlns:cx8="http://schemas.microsoft.com/office/drawing/2016/5/14/chartex" xmlns:mc="http://schemas.openxmlformats.org/markup-compatibility/2006" xmlns:aink="http://schemas.microsoft.com/office/drawing/2016/ink" xmlns:am3d="http://schemas.microsoft.com/office/drawing/2017/model3d" xmlns:o="urn:schemas-microsoft-com:office:office" xmlns:oel="http://schemas.microsoft.com/office/2019/extlst" xmlns:r="http://schemas.openxmlformats.org/officeDocument/2006/relationships" xmlns:m="http://schemas.openxmlformats.org/officeDocument/2006/math" xmlns:v="urn:schemas-microsoft-com:vml" xmlns:wp14="http://schemas.microsoft.com/office/word/2010/wordprocessingDrawing" xmlns:wp="http://schemas.openxmlformats.org/drawingml/2006/wordprocessingDrawing" xmlns:w10="urn:schemas-microsoft-com:office:word" xmlns:w="http://schemas.openxmlformats.org/wordprocessingml/2006/main" xmlns:w14="http://schemas.microsoft.com/office/word/2010/wordml" xmlns:w15="http://schemas.microsoft.com/office/word/2012/wordml" xmlns:w16cex="http://schemas.microsoft.com/office/word/2018/wordml/cex" xmlns:w16cid="http://schemas.microsoft.com/office/word/2016/wordml/cid" xmlns:w16="http://schemas.microsoft.com/office/word/2018/wordml" xmlns:w16du="http://schemas.microsoft.com/office/word/2023/wordml/word16du" xmlns:w16sdtdh="http://schemas.microsoft.com/office/word/2020/wordml/sdtdatahash" xmlns:w16sdtfl="http://schemas.microsoft.com/office/word/2024/wordml/sdtformatlock" xmlns:w16se="http://schemas.microsoft.com/office/word/2015/wordml/symex" xmlns:wpg="http://schemas.microsoft.com/office/word/2010/wordprocessingGroup" xmlns:wpi="http://schemas.microsoft.com/office/word/2010/wordprocessingInk" xmlns:wne="http://schemas.microsoft.com/office/word/2006/wordml" xmlns:wps="http://schemas.microsoft.com/office/word/2010/wordprocessingShape" mc:Ignorable="w14 w15 w16se w16cid w16 w16cex w16sdtdh w16sdtfl w16du wp14">
   <w:p>
     <w:pPr>
       <w:pStyle w:val="Header"/>
@@ -1839,7 +1891,7 @@
 </file>
 
 <file path=word/styles.xml><?xml version="1.0" encoding="utf-8"?>
-<w:styles xmlns:mc="http://schemas.openxmlformats.org/markup-compatibility/2006" xmlns:r="http://schemas.openxmlformats.org/officeDocument/2006/relationships" xmlns:w="http://schemas.openxmlformats.org/wordprocessingml/2006/main" xmlns:w14="http://schemas.microsoft.com/office/word/2010/wordml" xmlns:w15="http://schemas.microsoft.com/office/word/2012/wordml" xmlns:w16cex="http://schemas.microsoft.com/office/word/2018/wordml/cex" xmlns:w16cid="http://schemas.microsoft.com/office/word/2016/wordml/cid" xmlns:w16="http://schemas.microsoft.com/office/word/2018/wordml" xmlns:w16du="http://schemas.microsoft.com/office/word/2023/wordml/word16du" xmlns:w16sdtdh="http://schemas.microsoft.com/office/word/2020/wordml/sdtdatahash" xmlns:w16se="http://schemas.microsoft.com/office/word/2015/wordml/symex" mc:Ignorable="w14 w15 w16se w16cid w16 w16cex w16sdtdh w16du">
+<w:styles xmlns:mc="http://schemas.openxmlformats.org/markup-compatibility/2006" xmlns:r="http://schemas.openxmlformats.org/officeDocument/2006/relationships" xmlns:w="http://schemas.openxmlformats.org/wordprocessingml/2006/main" xmlns:w14="http://schemas.microsoft.com/office/word/2010/wordml" xmlns:w15="http://schemas.microsoft.com/office/word/2012/wordml" xmlns:w16cex="http://schemas.microsoft.com/office/word/2018/wordml/cex" xmlns:w16cid="http://schemas.microsoft.com/office/word/2016/wordml/cid" xmlns:w16="http://schemas.microsoft.com/office/word/2018/wordml" xmlns:w16du="http://schemas.microsoft.com/office/word/2023/wordml/word16du" xmlns:w16sdtdh="http://schemas.microsoft.com/office/word/2020/wordml/sdtdatahash" xmlns:w16sdtfl="http://schemas.microsoft.com/office/word/2024/wordml/sdtformatlock" xmlns:w16se="http://schemas.microsoft.com/office/word/2015/wordml/symex" mc:Ignorable="w14 w15 w16se w16cid w16 w16cex w16sdtdh w16sdtfl w16du">
   <w:docDefaults>
     <w:rPrDefault>
       <w:rPr>
@@ -2343,7 +2395,7 @@
 </file>
 
 <file path=word/glossary/document.xml><?xml version="1.0" encoding="utf-8"?>
-<w:glossaryDocument xmlns:wpc="http://schemas.microsoft.com/office/word/2010/wordprocessingCanvas" xmlns:cx="http://schemas.microsoft.com/office/drawing/2014/chartex" xmlns:cx1="http://schemas.microsoft.com/office/drawing/2015/9/8/chartex" xmlns:cx2="http://schemas.microsoft.com/office/drawing/2015/10/21/chartex" xmlns:cx3="http://schemas.microsoft.com/office/drawing/2016/5/9/chartex" xmlns:cx4="http://schemas.microsoft.com/office/drawing/2016/5/10/chartex" xmlns:cx5="http://schemas.microsoft.com/office/drawing/2016/5/11/chartex" xmlns:cx6="http://schemas.microsoft.com/office/drawing/2016/5/12/chartex" xmlns:cx7="http://schemas.microsoft.com/office/drawing/2016/5/13/chartex" xmlns:cx8="http://schemas.microsoft.com/office/drawing/2016/5/14/chartex" xmlns:mc="http://schemas.openxmlformats.org/markup-compatibility/2006" xmlns:aink="http://schemas.microsoft.com/office/drawing/2016/ink" xmlns:am3d="http://schemas.microsoft.com/office/drawing/2017/model3d" xmlns:o="urn:schemas-microsoft-com:office:office" xmlns:oel="http://schemas.microsoft.com/office/2019/extlst" xmlns:r="http://schemas.openxmlformats.org/officeDocument/2006/relationships" xmlns:m="http://schemas.openxmlformats.org/officeDocument/2006/math" xmlns:v="urn:schemas-microsoft-com:vml" xmlns:wp14="http://schemas.microsoft.com/office/word/2010/wordprocessingDrawing" xmlns:wp="http://schemas.openxmlformats.org/drawingml/2006/wordprocessingDrawing" xmlns:w10="urn:schemas-microsoft-com:office:word" xmlns:w="http://schemas.openxmlformats.org/wordprocessingml/2006/main" xmlns:w14="http://schemas.microsoft.com/office/word/2010/wordml" xmlns:w15="http://schemas.microsoft.com/office/word/2012/wordml" xmlns:w16cex="http://schemas.microsoft.com/office/word/2018/wordml/cex" xmlns:w16cid="http://schemas.microsoft.com/office/word/2016/wordml/cid" xmlns:w16="http://schemas.microsoft.com/office/word/2018/wordml" xmlns:w16du="http://schemas.microsoft.com/office/word/2023/wordml/word16du" xmlns:w16sdtdh="http://schemas.microsoft.com/office/word/2020/wordml/sdtdatahash" xmlns:w16se="http://schemas.microsoft.com/office/word/2015/wordml/symex" xmlns:wpg="http://schemas.microsoft.com/office/word/2010/wordprocessingGroup" xmlns:wpi="http://schemas.microsoft.com/office/word/2010/wordprocessingInk" xmlns:wne="http://schemas.microsoft.com/office/word/2006/wordml" xmlns:wps="http://schemas.microsoft.com/office/word/2010/wordprocessingShape" mc:Ignorable="w14 w15 w16se w16cid w16 w16cex w16sdtdh w16du wp14">
+<w:glossaryDocument xmlns:wpc="http://schemas.microsoft.com/office/word/2010/wordprocessingCanvas" xmlns:cx="http://schemas.microsoft.com/office/drawing/2014/chartex" xmlns:cx1="http://schemas.microsoft.com/office/drawing/2015/9/8/chartex" xmlns:cx2="http://schemas.microsoft.com/office/drawing/2015/10/21/chartex" xmlns:cx3="http://schemas.microsoft.com/office/drawing/2016/5/9/chartex" xmlns:cx4="http://schemas.microsoft.com/office/drawing/2016/5/10/chartex" xmlns:cx5="http://schemas.microsoft.com/office/drawing/2016/5/11/chartex" xmlns:cx6="http://schemas.microsoft.com/office/drawing/2016/5/12/chartex" xmlns:cx7="http://schemas.microsoft.com/office/drawing/2016/5/13/chartex" xmlns:cx8="http://schemas.microsoft.com/office/drawing/2016/5/14/chartex" xmlns:mc="http://schemas.openxmlformats.org/markup-compatibility/2006" xmlns:aink="http://schemas.microsoft.com/office/drawing/2016/ink" xmlns:am3d="http://schemas.microsoft.com/office/drawing/2017/model3d" xmlns:o="urn:schemas-microsoft-com:office:office" xmlns:oel="http://schemas.microsoft.com/office/2019/extlst" xmlns:r="http://schemas.openxmlformats.org/officeDocument/2006/relationships" xmlns:m="http://schemas.openxmlformats.org/officeDocument/2006/math" xmlns:v="urn:schemas-microsoft-com:vml" xmlns:wp14="http://schemas.microsoft.com/office/word/2010/wordprocessingDrawing" xmlns:wp="http://schemas.openxmlformats.org/drawingml/2006/wordprocessingDrawing" xmlns:w10="urn:schemas-microsoft-com:office:word" xmlns:w="http://schemas.openxmlformats.org/wordprocessingml/2006/main" xmlns:w14="http://schemas.microsoft.com/office/word/2010/wordml" xmlns:w15="http://schemas.microsoft.com/office/word/2012/wordml" xmlns:w16cex="http://schemas.microsoft.com/office/word/2018/wordml/cex" xmlns:w16cid="http://schemas.microsoft.com/office/word/2016/wordml/cid" xmlns:w16="http://schemas.microsoft.com/office/word/2018/wordml" xmlns:w16du="http://schemas.microsoft.com/office/word/2023/wordml/word16du" xmlns:w16sdtdh="http://schemas.microsoft.com/office/word/2020/wordml/sdtdatahash" xmlns:w16sdtfl="http://schemas.microsoft.com/office/word/2024/wordml/sdtformatlock" xmlns:w16se="http://schemas.microsoft.com/office/word/2015/wordml/symex" xmlns:wpg="http://schemas.microsoft.com/office/word/2010/wordprocessingGroup" xmlns:wpi="http://schemas.microsoft.com/office/word/2010/wordprocessingInk" xmlns:wne="http://schemas.microsoft.com/office/word/2006/wordml" xmlns:wps="http://schemas.microsoft.com/office/word/2010/wordprocessingShape" mc:Ignorable="w14 w15 w16se w16cid w16 w16cex w16sdtdh w16sdtfl w16du wp14">
   <w:docParts>
     <w:docPart>
       <w:docPartPr>
@@ -2402,7 +2454,7 @@
 </file>
 
 <file path=word/glossary/fontTable.xml><?xml version="1.0" encoding="utf-8"?>
-<w:fonts xmlns:mc="http://schemas.openxmlformats.org/markup-compatibility/2006" xmlns:r="http://schemas.openxmlformats.org/officeDocument/2006/relationships" xmlns:w="http://schemas.openxmlformats.org/wordprocessingml/2006/main" xmlns:w14="http://schemas.microsoft.com/office/word/2010/wordml" xmlns:w15="http://schemas.microsoft.com/office/word/2012/wordml" xmlns:w16cex="http://schemas.microsoft.com/office/word/2018/wordml/cex" xmlns:w16cid="http://schemas.microsoft.com/office/word/2016/wordml/cid" xmlns:w16="http://schemas.microsoft.com/office/word/2018/wordml" xmlns:w16du="http://schemas.microsoft.com/office/word/2023/wordml/word16du" xmlns:w16sdtdh="http://schemas.microsoft.com/office/word/2020/wordml/sdtdatahash" xmlns:w16se="http://schemas.microsoft.com/office/word/2015/wordml/symex" mc:Ignorable="w14 w15 w16se w16cid w16 w16cex w16sdtdh w16du">
+<w:fonts xmlns:mc="http://schemas.openxmlformats.org/markup-compatibility/2006" xmlns:r="http://schemas.openxmlformats.org/officeDocument/2006/relationships" xmlns:w="http://schemas.openxmlformats.org/wordprocessingml/2006/main" xmlns:w14="http://schemas.microsoft.com/office/word/2010/wordml" xmlns:w15="http://schemas.microsoft.com/office/word/2012/wordml" xmlns:w16cex="http://schemas.microsoft.com/office/word/2018/wordml/cex" xmlns:w16cid="http://schemas.microsoft.com/office/word/2016/wordml/cid" xmlns:w16="http://schemas.microsoft.com/office/word/2018/wordml" xmlns:w16du="http://schemas.microsoft.com/office/word/2023/wordml/word16du" xmlns:w16sdtdh="http://schemas.microsoft.com/office/word/2020/wordml/sdtdatahash" xmlns:w16sdtfl="http://schemas.microsoft.com/office/word/2024/wordml/sdtformatlock" xmlns:w16se="http://schemas.microsoft.com/office/word/2015/wordml/symex" mc:Ignorable="w14 w15 w16se w16cid w16 w16cex w16sdtdh w16sdtfl w16du">
   <w:font w:name="Calibri">
     <w:panose1 w:val="020F0502020204030204"/>
     <w:charset w:val="00"/>
@@ -2417,6 +2469,13 @@
     <w:pitch w:val="variable"/>
     <w:sig w:usb0="E0002EFF" w:usb1="C000785B" w:usb2="00000009" w:usb3="00000000" w:csb0="000001FF" w:csb1="00000000"/>
   </w:font>
+  <w:font w:name="Arial">
+    <w:panose1 w:val="020B0604020202020204"/>
+    <w:charset w:val="00"/>
+    <w:family w:val="swiss"/>
+    <w:pitch w:val="variable"/>
+    <w:sig w:usb0="E0002EFF" w:usb1="C000785B" w:usb2="00000009" w:usb3="00000000" w:csb0="000001FF" w:csb1="00000000"/>
+  </w:font>
   <w:font w:name="Calibri Light">
     <w:panose1 w:val="020F0302020204030204"/>
     <w:charset w:val="00"/>
@@ -2428,7 +2487,7 @@
 </file>
 
 <file path=word/glossary/settings.xml><?xml version="1.0" encoding="utf-8"?>
-<w:settings xmlns:mc="http://schemas.openxmlformats.org/markup-compatibility/2006" xmlns:o="urn:schemas-microsoft-com:office:office" xmlns:r="http://schemas.openxmlformats.org/officeDocument/2006/relationships" xmlns:m="http://schemas.openxmlformats.org/officeDocument/2006/math" xmlns:v="urn:schemas-microsoft-com:vml" xmlns:w10="urn:schemas-microsoft-com:office:word" xmlns:w="http://schemas.openxmlformats.org/wordprocessingml/2006/main" xmlns:w14="http://schemas.microsoft.com/office/word/2010/wordml" xmlns:w15="http://schemas.microsoft.com/office/word/2012/wordml" xmlns:w16cex="http://schemas.microsoft.com/office/word/2018/wordml/cex" xmlns:w16cid="http://schemas.microsoft.com/office/word/2016/wordml/cid" xmlns:w16="http://schemas.microsoft.com/office/word/2018/wordml" xmlns:w16du="http://schemas.microsoft.com/office/word/2023/wordml/word16du" xmlns:w16sdtdh="http://schemas.microsoft.com/office/word/2020/wordml/sdtdatahash" xmlns:w16se="http://schemas.microsoft.com/office/word/2015/wordml/symex" xmlns:sl="http://schemas.openxmlformats.org/schemaLibrary/2006/main" mc:Ignorable="w14 w15 w16se w16cid w16 w16cex w16sdtdh w16du">
+<w:settings xmlns:mc="http://schemas.openxmlformats.org/markup-compatibility/2006" xmlns:o="urn:schemas-microsoft-com:office:office" xmlns:r="http://schemas.openxmlformats.org/officeDocument/2006/relationships" xmlns:m="http://schemas.openxmlformats.org/officeDocument/2006/math" xmlns:v="urn:schemas-microsoft-com:vml" xmlns:w10="urn:schemas-microsoft-com:office:word" xmlns:w="http://schemas.openxmlformats.org/wordprocessingml/2006/main" xmlns:w14="http://schemas.microsoft.com/office/word/2010/wordml" xmlns:w15="http://schemas.microsoft.com/office/word/2012/wordml" xmlns:w16cex="http://schemas.microsoft.com/office/word/2018/wordml/cex" xmlns:w16cid="http://schemas.microsoft.com/office/word/2016/wordml/cid" xmlns:w16="http://schemas.microsoft.com/office/word/2018/wordml" xmlns:w16du="http://schemas.microsoft.com/office/word/2023/wordml/word16du" xmlns:w16sdtdh="http://schemas.microsoft.com/office/word/2020/wordml/sdtdatahash" xmlns:w16sdtfl="http://schemas.microsoft.com/office/word/2024/wordml/sdtformatlock" xmlns:w16se="http://schemas.microsoft.com/office/word/2015/wordml/symex" xmlns:sl="http://schemas.openxmlformats.org/schemaLibrary/2006/main" mc:Ignorable="w14 w15 w16se w16cid w16 w16cex w16sdtdh w16sdtfl w16du">
   <w:view w:val="normal"/>
   <w:defaultTabStop w:val="720"/>
   <w:characterSpacingControl w:val="doNotCompress"/>
@@ -2464,6 +2523,7 @@
     <w:rsid w:val="0025510D"/>
     <w:rsid w:val="00263F70"/>
     <w:rsid w:val="002B75E2"/>
+    <w:rsid w:val="002E08E3"/>
     <w:rsid w:val="002E3756"/>
     <w:rsid w:val="002E6337"/>
     <w:rsid w:val="002E7782"/>
@@ -2474,11 +2534,13 @@
     <w:rsid w:val="003D7289"/>
     <w:rsid w:val="003F6C20"/>
     <w:rsid w:val="004066E1"/>
+    <w:rsid w:val="00422798"/>
     <w:rsid w:val="004603B6"/>
     <w:rsid w:val="004802DA"/>
     <w:rsid w:val="004825E1"/>
     <w:rsid w:val="00483E82"/>
     <w:rsid w:val="004B1E0A"/>
+    <w:rsid w:val="004D0CF5"/>
     <w:rsid w:val="004D4050"/>
     <w:rsid w:val="00500103"/>
     <w:rsid w:val="005213F0"/>
@@ -2527,6 +2589,7 @@
     <w:rsid w:val="00947FBA"/>
     <w:rsid w:val="009718E3"/>
     <w:rsid w:val="009B0BD0"/>
+    <w:rsid w:val="009C0A22"/>
     <w:rsid w:val="009C4C5B"/>
     <w:rsid w:val="009F2EE6"/>
     <w:rsid w:val="00A240F9"/>
@@ -2550,6 +2613,7 @@
     <w:rsid w:val="00C374E3"/>
     <w:rsid w:val="00C55314"/>
     <w:rsid w:val="00C77BAC"/>
+    <w:rsid w:val="00CA312D"/>
     <w:rsid w:val="00CC46D9"/>
     <w:rsid w:val="00CE70BE"/>
     <w:rsid w:val="00CF77BD"/>
@@ -2586,7 +2650,7 @@
     <m:intLim m:val="subSup"/>
     <m:naryLim m:val="undOvr"/>
   </m:mathPr>
-  <w:themeFontLang w:val="en-US"/>
+  <w:themeFontLang w:val="en-US" w:bidi="ar-SA"/>
   <w:clrSchemeMapping w:bg1="light1" w:t1="dark1" w:bg2="light2" w:t2="dark2" w:accent1="accent1" w:accent2="accent2" w:accent3="accent3" w:accent4="accent4" w:accent5="accent5" w:accent6="accent6" w:hyperlink="hyperlink" w:followedHyperlink="followedHyperlink"/>
   <w:decimalSymbol w:val="."/>
   <w:listSeparator w:val=","/>
@@ -2595,7 +2659,7 @@
 </file>
 
 <file path=word/glossary/styles.xml><?xml version="1.0" encoding="utf-8"?>
-<w:styles xmlns:mc="http://schemas.openxmlformats.org/markup-compatibility/2006" xmlns:r="http://schemas.openxmlformats.org/officeDocument/2006/relationships" xmlns:w="http://schemas.openxmlformats.org/wordprocessingml/2006/main" xmlns:w14="http://schemas.microsoft.com/office/word/2010/wordml" xmlns:w15="http://schemas.microsoft.com/office/word/2012/wordml" xmlns:w16cex="http://schemas.microsoft.com/office/word/2018/wordml/cex" xmlns:w16cid="http://schemas.microsoft.com/office/word/2016/wordml/cid" xmlns:w16="http://schemas.microsoft.com/office/word/2018/wordml" xmlns:w16du="http://schemas.microsoft.com/office/word/2023/wordml/word16du" xmlns:w16sdtdh="http://schemas.microsoft.com/office/word/2020/wordml/sdtdatahash" xmlns:w16se="http://schemas.microsoft.com/office/word/2015/wordml/symex" mc:Ignorable="w14 w15 w16se w16cid w16 w16cex w16sdtdh w16du">
+<w:styles xmlns:mc="http://schemas.openxmlformats.org/markup-compatibility/2006" xmlns:r="http://schemas.openxmlformats.org/officeDocument/2006/relationships" xmlns:w="http://schemas.openxmlformats.org/wordprocessingml/2006/main" xmlns:w14="http://schemas.microsoft.com/office/word/2010/wordml" xmlns:w15="http://schemas.microsoft.com/office/word/2012/wordml" xmlns:w16cex="http://schemas.microsoft.com/office/word/2018/wordml/cex" xmlns:w16cid="http://schemas.microsoft.com/office/word/2016/wordml/cid" xmlns:w16="http://schemas.microsoft.com/office/word/2018/wordml" xmlns:w16du="http://schemas.microsoft.com/office/word/2023/wordml/word16du" xmlns:w16sdtdh="http://schemas.microsoft.com/office/word/2020/wordml/sdtdatahash" xmlns:w16sdtfl="http://schemas.microsoft.com/office/word/2024/wordml/sdtformatlock" xmlns:w16se="http://schemas.microsoft.com/office/word/2015/wordml/symex" mc:Ignorable="w14 w15 w16se w16cid w16 w16cex w16sdtdh w16sdtfl w16du">
   <w:docDefaults>
     <w:rPrDefault>
       <w:rPr>
@@ -3027,7 +3091,7 @@
     <w:basedOn w:val="DefaultParagraphFont"/>
     <w:uiPriority w:val="99"/>
     <w:semiHidden/>
-    <w:rsid w:val="00025579"/>
+    <w:rsid w:val="009C0A22"/>
     <w:rPr>
       <w:color w:val="666666"/>
     </w:rPr>
@@ -3036,7 +3100,7 @@
 </file>
 
 <file path=word/glossary/webSettings.xml><?xml version="1.0" encoding="utf-8"?>
-<w:webSettings xmlns:mc="http://schemas.openxmlformats.org/markup-compatibility/2006" xmlns:r="http://schemas.openxmlformats.org/officeDocument/2006/relationships" xmlns:w="http://schemas.openxmlformats.org/wordprocessingml/2006/main" xmlns:w14="http://schemas.microsoft.com/office/word/2010/wordml" xmlns:w15="http://schemas.microsoft.com/office/word/2012/wordml" xmlns:w16cex="http://schemas.microsoft.com/office/word/2018/wordml/cex" xmlns:w16cid="http://schemas.microsoft.com/office/word/2016/wordml/cid" xmlns:w16="http://schemas.microsoft.com/office/word/2018/wordml" xmlns:w16du="http://schemas.microsoft.com/office/word/2023/wordml/word16du" xmlns:w16sdtdh="http://schemas.microsoft.com/office/word/2020/wordml/sdtdatahash" xmlns:w16se="http://schemas.microsoft.com/office/word/2015/wordml/symex" mc:Ignorable="w14 w15 w16se w16cid w16 w16cex w16sdtdh w16du">
+<w:webSettings xmlns:mc="http://schemas.openxmlformats.org/markup-compatibility/2006" xmlns:r="http://schemas.openxmlformats.org/officeDocument/2006/relationships" xmlns:w="http://schemas.openxmlformats.org/wordprocessingml/2006/main" xmlns:w14="http://schemas.microsoft.com/office/word/2010/wordml" xmlns:w15="http://schemas.microsoft.com/office/word/2012/wordml" xmlns:w16cex="http://schemas.microsoft.com/office/word/2018/wordml/cex" xmlns:w16cid="http://schemas.microsoft.com/office/word/2016/wordml/cid" xmlns:w16="http://schemas.microsoft.com/office/word/2018/wordml" xmlns:w16du="http://schemas.microsoft.com/office/word/2023/wordml/word16du" xmlns:w16sdtdh="http://schemas.microsoft.com/office/word/2020/wordml/sdtdatahash" xmlns:w16sdtfl="http://schemas.microsoft.com/office/word/2024/wordml/sdtformatlock" xmlns:w16se="http://schemas.microsoft.com/office/word/2015/wordml/symex" mc:Ignorable="w14 w15 w16se w16cid w16 w16cex w16sdtdh w16sdtfl w16du">
   <w:optimizeForBrowser/>
   <w:allowPNG/>
 </w:webSettings>

</xml_diff>

<commit_message>
Update Payment Receipt report to reflect correct date column and increment version number
</commit_message>
<xml_diff>
--- a/PaymentReceipt.docx
+++ b/PaymentReceipt.docx
@@ -548,19 +548,19 @@
                   </w:r>
                   <w:sdt>
                     <w:sdtPr>
-                      <w:alias w:val="#Nav: /Payment_Mode2/CurrentDate"/>
-                      <w:tag w:val="#Nav: PaymentReceipt/50112"/>
-                      <w:id w:val="-1709092755"/>
+                      <w:id w:val="2125880669"/>
                       <w:placeholder>
                         <w:docPart w:val="DefaultPlaceholder_-1854013440"/>
                       </w:placeholder>
-                      <w:dataBinding w:prefixMappings="xmlns:ns0='urn:microsoft-dynamics-nav/reports/PaymentReceipt/50112/'" w:xpath="/ns0:NavWordReportXmlPart[1]/ns0:Payment_Mode2[1]/ns0:CurrentDate[1]" w:storeItemID="{072A5C88-FD1B-4274-ACD9-2C46D19524E4}"/>
+                      <w:dataBinding w:prefixMappings="xmlns:ns0='urn:microsoft-dynamics-nav/reports/PaymentReceipt/50112/' " w:xpath="/ns0:NavWordReportXmlPart[1]/ns0:Payment_Mode2[1]/ns0:Receipt_Date[1]" w:storeItemID="{072A5C88-FD1B-4274-ACD9-2C46D19524E4}"/>
                       <w:text/>
+                      <w:alias w:val="#Nav: /Payment_Mode2/Receipt_Date"/>
+                      <w:tag w:val="#Nav: PaymentReceipt/50112"/>
                     </w:sdtPr>
                     <w:sdtContent>
                       <w:proofErr w:type="spellStart"/>
                       <w:r>
-                        <w:t>CurrentDate</w:t>
+                        <w:t>Receipt_Date</w:t>
                       </w:r>
                       <w:proofErr w:type="spellEnd"/>
                     </w:sdtContent>
@@ -1243,14 +1243,14 @@
                         <w:p>
                           <w:sdt>
                             <w:sdtPr>
+                              <w:alias w:val="#Nav: /Payment_Mode2/Payment_Schedule2/Pay_S"/>
+                              <w:tag w:val="#Nav: PaymentReceipt/50112"/>
                               <w:id w:val="530459479"/>
                               <w:placeholder>
                                 <w:docPart w:val="DefaultPlaceholder_-1854013440"/>
                               </w:placeholder>
                               <w:dataBinding w:prefixMappings="xmlns:ns0='urn:microsoft-dynamics-nav/reports/PaymentReceipt/50112/' " w:xpath="/ns0:NavWordReportXmlPart[1]/ns0:Payment_Mode2[1]/ns0:Payment_Schedule2[1]/ns0:Pay_S[1]" w:storeItemID="{072A5C88-FD1B-4274-ACD9-2C46D19524E4}"/>
                               <w:text/>
-                              <w:alias w:val="#Nav: /Payment_Mode2/Payment_Schedule2/Pay_S"/>
-                              <w:tag w:val="#Nav: PaymentReceipt/50112"/>
                             </w:sdtPr>
                             <w:sdtContent>
                               <w:proofErr w:type="spellStart"/>
@@ -1267,14 +1267,14 @@
                       </w:tc>
                       <w:sdt>
                         <w:sdtPr>
+                          <w:alias w:val="#Nav: /Payment_Mode2/Payment_Schedule2/I_ID"/>
+                          <w:tag w:val="#Nav: PaymentReceipt/50112"/>
                           <w:id w:val="-1526708678"/>
                           <w:placeholder>
                             <w:docPart w:val="DefaultPlaceholder_-1854013440"/>
                           </w:placeholder>
                           <w:dataBinding w:prefixMappings="xmlns:ns0='urn:microsoft-dynamics-nav/reports/PaymentReceipt/50112/' " w:xpath="/ns0:NavWordReportXmlPart[1]/ns0:Payment_Mode2[1]/ns0:Payment_Schedule2[1]/ns0:I_ID[1]" w:storeItemID="{072A5C88-FD1B-4274-ACD9-2C46D19524E4}"/>
                           <w:text/>
-                          <w:alias w:val="#Nav: /Payment_Mode2/Payment_Schedule2/I_ID"/>
-                          <w:tag w:val="#Nav: PaymentReceipt/50112"/>
                         </w:sdtPr>
                         <w:sdtContent>
                           <w:tc>
@@ -1317,14 +1317,14 @@
                       </w:sdt>
                       <w:sdt>
                         <w:sdtPr>
+                          <w:alias w:val="#Nav: /Payment_Mode2/Payment_Schedule2/Pay_M"/>
+                          <w:tag w:val="#Nav: PaymentReceipt/50112"/>
                           <w:id w:val="-1825272108"/>
                           <w:placeholder>
                             <w:docPart w:val="DefaultPlaceholder_-1854013440"/>
                           </w:placeholder>
                           <w:dataBinding w:prefixMappings="xmlns:ns0='urn:microsoft-dynamics-nav/reports/PaymentReceipt/50112/' " w:xpath="/ns0:NavWordReportXmlPart[1]/ns0:Payment_Mode2[1]/ns0:Payment_Schedule2[1]/ns0:Pay_M[1]" w:storeItemID="{072A5C88-FD1B-4274-ACD9-2C46D19524E4}"/>
                           <w:text/>
-                          <w:alias w:val="#Nav: /Payment_Mode2/Payment_Schedule2/Pay_M"/>
-                          <w:tag w:val="#Nav: PaymentReceipt/50112"/>
                         </w:sdtPr>
                         <w:sdtContent>
                           <w:tc>
@@ -1343,14 +1343,14 @@
                       </w:sdt>
                       <w:sdt>
                         <w:sdtPr>
+                          <w:alias w:val="#Nav: /Payment_Mode2/Payment_Schedule2/Che_N"/>
+                          <w:tag w:val="#Nav: PaymentReceipt/50112"/>
                           <w:id w:val="-2133770087"/>
                           <w:placeholder>
                             <w:docPart w:val="DefaultPlaceholder_-1854013440"/>
                           </w:placeholder>
                           <w:dataBinding w:prefixMappings="xmlns:ns0='urn:microsoft-dynamics-nav/reports/PaymentReceipt/50112/' " w:xpath="/ns0:NavWordReportXmlPart[1]/ns0:Payment_Mode2[1]/ns0:Payment_Schedule2[1]/ns0:Che_N[1]" w:storeItemID="{072A5C88-FD1B-4274-ACD9-2C46D19524E4}"/>
                           <w:text/>
-                          <w:alias w:val="#Nav: /Payment_Mode2/Payment_Schedule2/Che_N"/>
-                          <w:tag w:val="#Nav: PaymentReceipt/50112"/>
                         </w:sdtPr>
                         <w:sdtContent>
                           <w:tc>
@@ -2506,6 +2506,7 @@
     <w:rsid w:val="00020009"/>
     <w:rsid w:val="000210AD"/>
     <w:rsid w:val="00025579"/>
+    <w:rsid w:val="000558FF"/>
     <w:rsid w:val="0007544D"/>
     <w:rsid w:val="000810CE"/>
     <w:rsid w:val="000A06FE"/>
@@ -2533,6 +2534,7 @@
     <w:rsid w:val="0037100D"/>
     <w:rsid w:val="003D7289"/>
     <w:rsid w:val="003F6C20"/>
+    <w:rsid w:val="003F773A"/>
     <w:rsid w:val="004066E1"/>
     <w:rsid w:val="00422798"/>
     <w:rsid w:val="004603B6"/>
@@ -3401,7 +3403,11 @@
 </a:theme>
 </file>
 
-<file path=customXml/item1.xml>��< ? x m l   v e r s i o n = " 1 . 0 "   e n c o d i n g = " u t f - 1 6 " ? > +<file path=customXml/item1.xml><?xml version="1.0" encoding="utf-8"?>
+<b:Sources xmlns:b="http://schemas.openxmlformats.org/officeDocument/2006/bibliography" xmlns="http://schemas.openxmlformats.org/officeDocument/2006/bibliography" SelectedStyle="\APASixthEditionOfficeOnline.xsl" StyleName="APA" Version="6"/>
+</file>
+
+<file path=customXml/item2.xml>��< ? x m l   v e r s i o n = " 1 . 0 "   e n c o d i n g = " u t f - 1 6 " ? >   
  < N a v W o r d R e p o r t X m l P a r t   x m l n s = " u r n : m i c r o s o f t - d y n a m i c s - n a v / r e p o r t s / P a y m e n t R e c e i p t / 5 0 1 1 2 / " >   
@@ -3491,7 +3497,7 @@
  
          < C o n t r a c t _ I D > C o n t r a c t _ I D < / C o n t r a c t _ I D >   
-         < C u r r e n t D a t e > C u r r e n t D a t e < / C u r r e n t D a t e > +         < R e c e i p t _ D a t e > R e c e i p t _ D a t e < / R e c e i p t _ D a t e >   
          < R e c e i p t _ _ > R e c e i p t _ _ < / R e c e i p t _ _ >   
@@ -3560,22 +3566,18 @@
  < / N a v W o r d R e p o r t X m l P a r t > 
 </file>
 
-<file path=customXml/item2.xml><?xml version="1.0" encoding="utf-8"?>
-<b:Sources xmlns:b="http://schemas.openxmlformats.org/officeDocument/2006/bibliography" xmlns="http://schemas.openxmlformats.org/officeDocument/2006/bibliography" SelectedStyle="\APASixthEditionOfficeOnline.xsl" StyleName="APA" Version="6"/>
+<file path=customXml/itemProps1.xml><?xml version="1.0" encoding="utf-8"?>
+<ds:datastoreItem xmlns:ds="http://schemas.openxmlformats.org/officeDocument/2006/customXml" ds:itemID="{3B112A52-EB5A-4E31-A5FE-37B72C03D9CF}">
+  <ds:schemaRefs>
+    <ds:schemaRef ds:uri="http://schemas.openxmlformats.org/officeDocument/2006/bibliography"/>
+  </ds:schemaRefs>
+</ds:datastoreItem>
 </file>
 
-<file path=customXml/itemProps1.xml><?xml version="1.0" encoding="utf-8"?>
+<file path=customXml/itemProps2.xml><?xml version="1.0" encoding="utf-8"?>
 <ds:datastoreItem xmlns:ds="http://schemas.openxmlformats.org/officeDocument/2006/customXml" ds:itemID="{072A5C88-FD1B-4274-ACD9-2C46D19524E4}">
   <ds:schemaRefs>
     <ds:schemaRef ds:uri="urn:microsoft-dynamics-nav/reports/PaymentReceipt/50112/"/>
   </ds:schemaRefs>
 </ds:datastoreItem>
-</file>
-
-<file path=customXml/itemProps2.xml><?xml version="1.0" encoding="utf-8"?>
-<ds:datastoreItem xmlns:ds="http://schemas.openxmlformats.org/officeDocument/2006/customXml" ds:itemID="{3B112A52-EB5A-4E31-A5FE-37B72C03D9CF}">
-  <ds:schemaRefs>
-    <ds:schemaRef ds:uri="http://schemas.openxmlformats.org/officeDocument/2006/bibliography"/>
-  </ds:schemaRefs>
-</ds:datastoreItem>
 </file>
</xml_diff>